<commit_message>
Strengthen RuFLEX article readiness workflow
</commit_message>
<xml_diff>
--- a/docs/article/conference_template_illustrated_en.docx
+++ b/docs/article/conference_template_illustrated_en.docx
@@ -36,6 +36,14 @@
       </w:pPr>
       <w:r>
         <w:t>author1@example.com, author2@example.com</w:t>
+      </w:r>
+    </w:p>
+    <w:p>
+      <w:pPr>
+        <w:jc w:val="center"/>
+      </w:pPr>
+      <w:r>
+        <w:t>ORCID: 0000-0000-0000-0000, 0000-0000-0000-0000</w:t>
       </w:r>
     </w:p>
     <w:p>
@@ -954,7 +962,7 @@
         <w:pStyle w:val="ListNumber"/>
       </w:pPr>
       <w:r>
-        <w:t>X. Ma, L. Chen, Z. Deng et al., “Deep Image Feature Learning With Fuzzy Rules,” IEEE Transactions on Emerging Topics in Computational Intelligence, vol. 8, pp. 724-737, 2024.</w:t>
+        <w:t>X. Ma, L. Chen, Z. Deng Z. et al., “Deep Image Feature Learning With Fuzzy Rules,” IEEE Transactions on Emerging Topics in Computational Intelligence, vol. 8, pp. 724-737, 2024.</w:t>
       </w:r>
     </w:p>
     <w:p>

</xml_diff>